<commit_message>
Added UML to docmentation
</commit_message>
<xml_diff>
--- a/docs/SDEV200_Final_Project_Documentation.docx
+++ b/docs/SDEV200_Final_Project_Documentation.docx
@@ -390,21 +390,7 @@
           <w:szCs w:val="24"/>
           <w:rtl w:val="0"/>
         </w:rPr>
-        <w:t xml:space="preserve">The remainder of this document describes each screen individually and includes screenshots and input/output for events on the screen.</w:t>
-      </w:r>
-    </w:p>
-    <w:p>
-      <w:pPr>
-        <w:rPr>
-          <w:rFonts w:ascii="Cabin" w:cs="Cabin" w:eastAsia="Cabin" w:hAnsi="Cabin"/>
-          <w:sz w:val="24"/>
-          <w:szCs w:val="24"/>
-        </w:rPr>
-      </w:pPr>
-      <w:r>
-        <w:rPr>
-          <w:rtl w:val="0"/>
-        </w:rPr>
+        <w:t xml:space="preserve">The remainder of this document describes each screen individually and includes screenshots and input/output for events on the screen. A UML diagram for all non-UI classes is provided at the end.</w:t>
       </w:r>
     </w:p>
     <w:p>
@@ -691,12 +677,12 @@
           <wp:inline distB="114300" distT="114300" distL="114300" distR="114300">
             <wp:extent cx="5943600" cy="4775200"/>
             <wp:effectExtent b="0" l="0" r="0" t="0"/>
-            <wp:docPr id="4" name="image10.png"/>
+            <wp:docPr id="4" name="image8.png"/>
             <a:graphic>
               <a:graphicData uri="http://schemas.openxmlformats.org/drawingml/2006/picture">
                 <pic:pic>
                   <pic:nvPicPr>
-                    <pic:cNvPr id="0" name="image10.png"/>
+                    <pic:cNvPr id="0" name="image8.png"/>
                     <pic:cNvPicPr preferRelativeResize="0"/>
                   </pic:nvPicPr>
                   <pic:blipFill>
@@ -923,12 +909,12 @@
           <wp:inline distB="114300" distT="114300" distL="114300" distR="114300">
             <wp:extent cx="5943600" cy="4762500"/>
             <wp:effectExtent b="0" l="0" r="0" t="0"/>
-            <wp:docPr id="10" name="image5.png"/>
+            <wp:docPr id="12" name="image2.png"/>
             <a:graphic>
               <a:graphicData uri="http://schemas.openxmlformats.org/drawingml/2006/picture">
                 <pic:pic>
                   <pic:nvPicPr>
-                    <pic:cNvPr id="0" name="image5.png"/>
+                    <pic:cNvPr id="0" name="image2.png"/>
                     <pic:cNvPicPr preferRelativeResize="0"/>
                   </pic:nvPicPr>
                   <pic:blipFill>
@@ -1267,12 +1253,12 @@
           <wp:inline distB="114300" distT="114300" distL="114300" distR="114300">
             <wp:extent cx="5943600" cy="4787900"/>
             <wp:effectExtent b="0" l="0" r="0" t="0"/>
-            <wp:docPr id="6" name="image8.png"/>
+            <wp:docPr id="8" name="image9.png"/>
             <a:graphic>
               <a:graphicData uri="http://schemas.openxmlformats.org/drawingml/2006/picture">
                 <pic:pic>
                   <pic:nvPicPr>
-                    <pic:cNvPr id="0" name="image8.png"/>
+                    <pic:cNvPr id="0" name="image9.png"/>
                     <pic:cNvPicPr preferRelativeResize="0"/>
                   </pic:nvPicPr>
                   <pic:blipFill>
@@ -1572,12 +1558,12 @@
           <wp:inline distB="114300" distT="114300" distL="114300" distR="114300">
             <wp:extent cx="5943600" cy="4775200"/>
             <wp:effectExtent b="0" l="0" r="0" t="0"/>
-            <wp:docPr id="2" name="image6.png"/>
+            <wp:docPr id="2" name="image11.png"/>
             <a:graphic>
               <a:graphicData uri="http://schemas.openxmlformats.org/drawingml/2006/picture">
                 <pic:pic>
                   <pic:nvPicPr>
-                    <pic:cNvPr id="0" name="image6.png"/>
+                    <pic:cNvPr id="0" name="image11.png"/>
                     <pic:cNvPicPr preferRelativeResize="0"/>
                   </pic:nvPicPr>
                   <pic:blipFill>
@@ -1820,12 +1806,12 @@
           <wp:inline distB="114300" distT="114300" distL="114300" distR="114300">
             <wp:extent cx="5943600" cy="4787900"/>
             <wp:effectExtent b="0" l="0" r="0" t="0"/>
-            <wp:docPr id="12" name="image4.png"/>
+            <wp:docPr id="14" name="image1.png"/>
             <a:graphic>
               <a:graphicData uri="http://schemas.openxmlformats.org/drawingml/2006/picture">
                 <pic:pic>
                   <pic:nvPicPr>
-                    <pic:cNvPr id="0" name="image4.png"/>
+                    <pic:cNvPr id="0" name="image1.png"/>
                     <pic:cNvPicPr preferRelativeResize="0"/>
                   </pic:nvPicPr>
                   <pic:blipFill>
@@ -2014,15 +2000,7 @@
           <w:szCs w:val="24"/>
           <w:rtl w:val="0"/>
         </w:rPr>
-        <w:t xml:space="preserve">Pressing the trash icon removes the playlist, but keeps its playback going if it is currently playing.</w:t>
-      </w:r>
-      <w:r>
-        <w:br w:type="page"/>
-      </w:r>
-      <w:r>
-        <w:rPr>
-          <w:rtl w:val="0"/>
-        </w:rPr>
+        <w:t xml:space="preserve">Pressing the trash icon removes the playlist, but playback continues using the existing track queue even after the playlist is deleted.</w:t>
       </w:r>
     </w:p>
     <w:p>
@@ -2064,12 +2042,12 @@
           <wp:inline distB="114300" distT="114300" distL="114300" distR="114300">
             <wp:extent cx="5943600" cy="4775200"/>
             <wp:effectExtent b="0" l="0" r="0" t="0"/>
-            <wp:docPr id="9" name="image12.png"/>
+            <wp:docPr id="11" name="image13.png"/>
             <a:graphic>
               <a:graphicData uri="http://schemas.openxmlformats.org/drawingml/2006/picture">
                 <pic:pic>
                   <pic:nvPicPr>
-                    <pic:cNvPr id="0" name="image12.png"/>
+                    <pic:cNvPr id="0" name="image13.png"/>
                     <pic:cNvPicPr preferRelativeResize="0"/>
                   </pic:nvPicPr>
                   <pic:blipFill>
@@ -2326,12 +2304,12 @@
           <wp:inline distB="114300" distT="114300" distL="114300" distR="114300">
             <wp:extent cx="5895975" cy="4721009"/>
             <wp:effectExtent b="0" l="0" r="0" t="0"/>
-            <wp:docPr id="1" name="image9.png"/>
+            <wp:docPr id="1" name="image12.png"/>
             <a:graphic>
               <a:graphicData uri="http://schemas.openxmlformats.org/drawingml/2006/picture">
                 <pic:pic>
                   <pic:nvPicPr>
-                    <pic:cNvPr id="0" name="image9.png"/>
+                    <pic:cNvPr id="0" name="image12.png"/>
                     <pic:cNvPicPr preferRelativeResize="0"/>
                   </pic:nvPicPr>
                   <pic:blipFill>
@@ -2514,12 +2492,12 @@
           <wp:inline distB="114300" distT="114300" distL="114300" distR="114300">
             <wp:extent cx="5943600" cy="4762500"/>
             <wp:effectExtent b="0" l="0" r="0" t="0"/>
-            <wp:docPr id="5" name="image3.png"/>
+            <wp:docPr id="7" name="image4.png"/>
             <a:graphic>
               <a:graphicData uri="http://schemas.openxmlformats.org/drawingml/2006/picture">
                 <pic:pic>
                   <pic:nvPicPr>
-                    <pic:cNvPr id="0" name="image3.png"/>
+                    <pic:cNvPr id="0" name="image4.png"/>
                     <pic:cNvPicPr preferRelativeResize="0"/>
                   </pic:nvPicPr>
                   <pic:blipFill>
@@ -2624,12 +2602,12 @@
           <wp:inline distB="114300" distT="114300" distL="114300" distR="114300">
             <wp:extent cx="5895975" cy="4727791"/>
             <wp:effectExtent b="0" l="0" r="0" t="0"/>
-            <wp:docPr id="7" name="image2.png"/>
+            <wp:docPr id="9" name="image3.png"/>
             <a:graphic>
               <a:graphicData uri="http://schemas.openxmlformats.org/drawingml/2006/picture">
                 <pic:pic>
                   <pic:nvPicPr>
-                    <pic:cNvPr id="0" name="image2.png"/>
+                    <pic:cNvPr id="0" name="image3.png"/>
                     <pic:cNvPicPr preferRelativeResize="0"/>
                   </pic:nvPicPr>
                   <pic:blipFill>
@@ -2781,12 +2759,12 @@
           <wp:inline distB="114300" distT="114300" distL="114300" distR="114300">
             <wp:extent cx="5943600" cy="4787900"/>
             <wp:effectExtent b="0" l="0" r="0" t="0"/>
-            <wp:docPr id="8" name="image1.png"/>
+            <wp:docPr id="10" name="image5.png"/>
             <a:graphic>
               <a:graphicData uri="http://schemas.openxmlformats.org/drawingml/2006/picture">
                 <pic:pic>
                   <pic:nvPicPr>
-                    <pic:cNvPr id="0" name="image1.png"/>
+                    <pic:cNvPr id="0" name="image5.png"/>
                     <pic:cNvPicPr preferRelativeResize="0"/>
                   </pic:nvPicPr>
                   <pic:blipFill>
@@ -3058,12 +3036,12 @@
           <wp:inline distB="114300" distT="114300" distL="114300" distR="114300">
             <wp:extent cx="5943600" cy="4775200"/>
             <wp:effectExtent b="0" l="0" r="0" t="0"/>
-            <wp:docPr id="11" name="image7.png"/>
+            <wp:docPr id="13" name="image14.png"/>
             <a:graphic>
               <a:graphicData uri="http://schemas.openxmlformats.org/drawingml/2006/picture">
                 <pic:pic>
                   <pic:nvPicPr>
-                    <pic:cNvPr id="0" name="image7.png"/>
+                    <pic:cNvPr id="0" name="image14.png"/>
                     <pic:cNvPicPr preferRelativeResize="0"/>
                   </pic:nvPicPr>
                   <pic:blipFill>
@@ -3328,12 +3306,12 @@
           <wp:inline distB="114300" distT="114300" distL="114300" distR="114300">
             <wp:extent cx="5943600" cy="4762500"/>
             <wp:effectExtent b="0" l="0" r="0" t="0"/>
-            <wp:docPr id="3" name="image11.png"/>
+            <wp:docPr id="3" name="image6.png"/>
             <a:graphic>
               <a:graphicData uri="http://schemas.openxmlformats.org/drawingml/2006/picture">
                 <pic:pic>
                   <pic:nvPicPr>
-                    <pic:cNvPr id="0" name="image11.png"/>
+                    <pic:cNvPr id="0" name="image6.png"/>
                     <pic:cNvPicPr preferRelativeResize="0"/>
                   </pic:nvPicPr>
                   <pic:blipFill>
@@ -3347,6 +3325,116 @@
                     <a:xfrm>
                       <a:off x="0" y="0"/>
                       <a:ext cx="5943600" cy="4762500"/>
+                    </a:xfrm>
+                    <a:prstGeom prst="rect"/>
+                    <a:ln/>
+                  </pic:spPr>
+                </pic:pic>
+              </a:graphicData>
+            </a:graphic>
+          </wp:inline>
+        </w:drawing>
+      </w:r>
+      <w:r>
+        <w:br w:type="page"/>
+      </w:r>
+      <w:r>
+        <w:rPr>
+          <w:rtl w:val="0"/>
+        </w:rPr>
+      </w:r>
+    </w:p>
+    <w:p>
+      <w:pPr>
+        <w:pStyle w:val="Heading2"/>
+        <w:ind w:left="720" w:firstLine="0"/>
+        <w:rPr/>
+      </w:pPr>
+      <w:bookmarkStart w:colFirst="0" w:colLast="0" w:name="_i2fodziudg6b" w:id="19"/>
+      <w:bookmarkEnd w:id="19"/>
+      <w:r>
+        <w:rPr>
+          <w:rtl w:val="0"/>
+        </w:rPr>
+        <w:t xml:space="preserve">UML</w:t>
+      </w:r>
+    </w:p>
+    <w:p>
+      <w:pPr>
+        <w:jc w:val="center"/>
+        <w:rPr/>
+      </w:pPr>
+      <w:r>
+        <w:rPr/>
+        <w:drawing>
+          <wp:inline distB="114300" distT="114300" distL="114300" distR="114300">
+            <wp:extent cx="5434013" cy="7854709"/>
+            <wp:effectExtent b="0" l="0" r="0" t="0"/>
+            <wp:docPr id="5" name="image7.png"/>
+            <a:graphic>
+              <a:graphicData uri="http://schemas.openxmlformats.org/drawingml/2006/picture">
+                <pic:pic>
+                  <pic:nvPicPr>
+                    <pic:cNvPr id="0" name="image7.png"/>
+                    <pic:cNvPicPr preferRelativeResize="0"/>
+                  </pic:nvPicPr>
+                  <pic:blipFill>
+                    <a:blip r:embed="rId19"/>
+                    <a:srcRect b="0" l="0" r="0" t="0"/>
+                    <a:stretch>
+                      <a:fillRect/>
+                    </a:stretch>
+                  </pic:blipFill>
+                  <pic:spPr>
+                    <a:xfrm>
+                      <a:off x="0" y="0"/>
+                      <a:ext cx="5434013" cy="7854709"/>
+                    </a:xfrm>
+                    <a:prstGeom prst="rect"/>
+                    <a:ln/>
+                  </pic:spPr>
+                </pic:pic>
+              </a:graphicData>
+            </a:graphic>
+          </wp:inline>
+        </w:drawing>
+      </w:r>
+      <w:r>
+        <w:rPr>
+          <w:rtl w:val="0"/>
+        </w:rPr>
+      </w:r>
+    </w:p>
+    <w:p>
+      <w:pPr>
+        <w:jc w:val="center"/>
+        <w:rPr/>
+      </w:pPr>
+      <w:r>
+        <w:rPr/>
+        <w:drawing>
+          <wp:inline distB="114300" distT="114300" distL="114300" distR="114300">
+            <wp:extent cx="3957638" cy="8189449"/>
+            <wp:effectExtent b="0" l="0" r="0" t="0"/>
+            <wp:docPr id="6" name="image10.png"/>
+            <a:graphic>
+              <a:graphicData uri="http://schemas.openxmlformats.org/drawingml/2006/picture">
+                <pic:pic>
+                  <pic:nvPicPr>
+                    <pic:cNvPr id="0" name="image10.png"/>
+                    <pic:cNvPicPr preferRelativeResize="0"/>
+                  </pic:nvPicPr>
+                  <pic:blipFill>
+                    <a:blip r:embed="rId20"/>
+                    <a:srcRect b="0" l="0" r="0" t="0"/>
+                    <a:stretch>
+                      <a:fillRect/>
+                    </a:stretch>
+                  </pic:blipFill>
+                  <pic:spPr>
+                    <a:xfrm>
+                      <a:off x="0" y="0"/>
+                      <a:ext cx="3957638" cy="8189449"/>
                     </a:xfrm>
                     <a:prstGeom prst="rect"/>
                     <a:ln/>

</xml_diff>